<commit_message>
Ajout de la fonctionalitée de pioche
</commit_message>
<xml_diff>
--- a/Planning_Solitaire.docx
+++ b/Planning_Solitaire.docx
@@ -205,12 +205,6 @@
         <w:gridCol w:w="2763"/>
       </w:tblGrid>
       <w:tr>
-        <w:tblPrEx>
-          <w:tblCellMar>
-            <w:top w:w="0" w:type="dxa"/>
-            <w:bottom w:w="0" w:type="dxa"/>
-          </w:tblCellMar>
-        </w:tblPrEx>
         <w:trPr>
           <w:tblHeader/>
         </w:trPr>
@@ -312,12 +306,6 @@
         </w:tc>
       </w:tr>
       <w:tr>
-        <w:tblPrEx>
-          <w:tblCellMar>
-            <w:top w:w="0" w:type="dxa"/>
-            <w:bottom w:w="0" w:type="dxa"/>
-          </w:tblCellMar>
-        </w:tblPrEx>
         <w:tc>
           <w:tcPr>
             <w:tcW w:w="1900" w:type="dxa"/>
@@ -400,12 +388,6 @@
         </w:tc>
       </w:tr>
       <w:tr>
-        <w:tblPrEx>
-          <w:tblCellMar>
-            <w:top w:w="0" w:type="dxa"/>
-            <w:bottom w:w="0" w:type="dxa"/>
-          </w:tblCellMar>
-        </w:tblPrEx>
         <w:tc>
           <w:tcPr>
             <w:tcW w:w="1900" w:type="dxa"/>
@@ -488,12 +470,6 @@
         </w:tc>
       </w:tr>
       <w:tr>
-        <w:tblPrEx>
-          <w:tblCellMar>
-            <w:top w:w="0" w:type="dxa"/>
-            <w:bottom w:w="0" w:type="dxa"/>
-          </w:tblCellMar>
-        </w:tblPrEx>
         <w:tc>
           <w:tcPr>
             <w:tcW w:w="1900" w:type="dxa"/>
@@ -576,12 +552,6 @@
         </w:tc>
       </w:tr>
       <w:tr>
-        <w:tblPrEx>
-          <w:tblCellMar>
-            <w:top w:w="0" w:type="dxa"/>
-            <w:bottom w:w="0" w:type="dxa"/>
-          </w:tblCellMar>
-        </w:tblPrEx>
         <w:tc>
           <w:tcPr>
             <w:tcW w:w="1900" w:type="dxa"/>
@@ -664,12 +634,6 @@
         </w:tc>
       </w:tr>
       <w:tr>
-        <w:tblPrEx>
-          <w:tblCellMar>
-            <w:top w:w="0" w:type="dxa"/>
-            <w:bottom w:w="0" w:type="dxa"/>
-          </w:tblCellMar>
-        </w:tblPrEx>
         <w:tc>
           <w:tcPr>
             <w:tcW w:w="1900" w:type="dxa"/>
@@ -798,25 +762,27 @@
           <w:numId w:val="2"/>
         </w:numPr>
         <w:spacing w:after="60"/>
-      </w:pPr>
-      <w:r>
+        <w:rPr>
+          <w:highlight w:val="yellow"/>
+        </w:rPr>
+      </w:pPr>
+      <w:r>
+        <w:rPr>
+          <w:highlight w:val="yellow"/>
+        </w:rPr>
         <w:t xml:space="preserve">Finaliser le menu principal et la boucle </w:t>
       </w:r>
-      <w:proofErr w:type="gramStart"/>
-      <w:r>
-        <w:rPr>
-          <w:rFonts w:ascii="Consolas" w:eastAsia="Consolas" w:hAnsi="Consolas" w:cs="Consolas"/>
-        </w:rPr>
-        <w:t>jouer(</w:t>
-      </w:r>
-      <w:proofErr w:type="gramEnd"/>
-      <w:r>
-        <w:rPr>
-          <w:rFonts w:ascii="Consolas" w:eastAsia="Consolas" w:hAnsi="Consolas" w:cs="Consolas"/>
-        </w:rPr>
-        <w:t>)</w:t>
-      </w:r>
-      <w:r>
+      <w:r>
+        <w:rPr>
+          <w:rFonts w:ascii="Consolas" w:eastAsia="Consolas" w:hAnsi="Consolas" w:cs="Consolas"/>
+          <w:highlight w:val="yellow"/>
+        </w:rPr>
+        <w:t>jouer()</w:t>
+      </w:r>
+      <w:r>
+        <w:rPr>
+          <w:highlight w:val="yellow"/>
+        </w:rPr>
         <w:t>.</w:t>
       </w:r>
     </w:p>
@@ -828,22 +794,163 @@
           <w:numId w:val="2"/>
         </w:numPr>
         <w:spacing w:after="60"/>
-      </w:pPr>
-      <w:r>
+        <w:rPr>
+          <w:highlight w:val="yellow"/>
+        </w:rPr>
+      </w:pPr>
+      <w:r>
+        <w:rPr>
+          <w:highlight w:val="yellow"/>
+        </w:rPr>
         <w:t xml:space="preserve">Écrire la partie « saisie » de </w:t>
       </w:r>
+      <w:proofErr w:type="spellStart"/>
+      <w:r>
+        <w:rPr>
+          <w:rFonts w:ascii="Consolas" w:eastAsia="Consolas" w:hAnsi="Consolas" w:cs="Consolas"/>
+          <w:highlight w:val="yellow"/>
+        </w:rPr>
+        <w:t>deplacer</w:t>
+      </w:r>
+      <w:proofErr w:type="spellEnd"/>
+      <w:r>
+        <w:rPr>
+          <w:rFonts w:ascii="Consolas" w:eastAsia="Consolas" w:hAnsi="Consolas" w:cs="Consolas"/>
+          <w:highlight w:val="yellow"/>
+        </w:rPr>
+        <w:t>()</w:t>
+      </w:r>
+      <w:r>
+        <w:rPr>
+          <w:highlight w:val="yellow"/>
+        </w:rPr>
+        <w:t xml:space="preserve"> : demander la source, la destination et le nombre de cartes.</w:t>
+      </w:r>
+    </w:p>
+    <w:p>
+      <w:pPr>
+        <w:pStyle w:val="Paragraphedeliste"/>
+        <w:numPr>
+          <w:ilvl w:val="0"/>
+          <w:numId w:val="2"/>
+        </w:numPr>
+        <w:spacing w:after="60"/>
+        <w:rPr>
+          <w:highlight w:val="yellow"/>
+        </w:rPr>
+      </w:pPr>
+      <w:r>
+        <w:rPr>
+          <w:highlight w:val="yellow"/>
+        </w:rPr>
+        <w:t>Vérifier que la saisie est valide (numéro de colonne entre 1 et 7, nombre de cartes disponible…).</w:t>
+      </w:r>
+    </w:p>
+    <w:p>
+      <w:pPr>
+        <w:pStyle w:val="Titre2"/>
+        <w:rPr>
+          <w:highlight w:val="yellow"/>
+        </w:rPr>
+      </w:pPr>
+    </w:p>
+    <w:p>
+      <w:pPr>
+        <w:pStyle w:val="Paragraphedeliste"/>
+        <w:numPr>
+          <w:ilvl w:val="0"/>
+          <w:numId w:val="2"/>
+        </w:numPr>
+        <w:spacing w:after="60"/>
+        <w:rPr>
+          <w:highlight w:val="yellow"/>
+        </w:rPr>
+      </w:pPr>
+      <w:proofErr w:type="spellStart"/>
+      <w:r>
+        <w:rPr>
+          <w:rFonts w:ascii="Consolas" w:eastAsia="Consolas" w:hAnsi="Consolas" w:cs="Consolas"/>
+          <w:highlight w:val="yellow"/>
+        </w:rPr>
+        <w:t>estRouge</w:t>
+      </w:r>
+      <w:proofErr w:type="spellEnd"/>
+      <w:r>
+        <w:rPr>
+          <w:rFonts w:ascii="Consolas" w:eastAsia="Consolas" w:hAnsi="Consolas" w:cs="Consolas"/>
+          <w:highlight w:val="yellow"/>
+        </w:rPr>
+        <w:t>(carte)</w:t>
+      </w:r>
+      <w:r>
+        <w:rPr>
+          <w:highlight w:val="yellow"/>
+        </w:rPr>
+        <w:t xml:space="preserve"> : indique si une carte est rouge (cœur, carreau).</w:t>
+      </w:r>
+    </w:p>
+    <w:p>
+      <w:pPr>
+        <w:pStyle w:val="Paragraphedeliste"/>
+        <w:numPr>
+          <w:ilvl w:val="0"/>
+          <w:numId w:val="2"/>
+        </w:numPr>
+        <w:spacing w:after="60"/>
+        <w:rPr>
+          <w:highlight w:val="yellow"/>
+        </w:rPr>
+      </w:pPr>
+      <w:proofErr w:type="spellStart"/>
+      <w:r>
+        <w:rPr>
+          <w:rFonts w:ascii="Consolas" w:eastAsia="Consolas" w:hAnsi="Consolas" w:cs="Consolas"/>
+          <w:highlight w:val="yellow"/>
+        </w:rPr>
+        <w:lastRenderedPageBreak/>
+        <w:t>peutPoserSurColonne</w:t>
+      </w:r>
+      <w:proofErr w:type="spellEnd"/>
+      <w:r>
+        <w:rPr>
+          <w:rFonts w:ascii="Consolas" w:eastAsia="Consolas" w:hAnsi="Consolas" w:cs="Consolas"/>
+          <w:highlight w:val="yellow"/>
+        </w:rPr>
+        <w:t>(carte, colonne)</w:t>
+      </w:r>
+      <w:r>
+        <w:rPr>
+          <w:highlight w:val="yellow"/>
+        </w:rPr>
+        <w:t xml:space="preserve"> : couleur alternée et valeur inférieure de 1, ou un Roi sur une colonne vide.</w:t>
+      </w:r>
+    </w:p>
+    <w:p>
+      <w:pPr>
+        <w:pStyle w:val="Paragraphedeliste"/>
+        <w:numPr>
+          <w:ilvl w:val="0"/>
+          <w:numId w:val="2"/>
+        </w:numPr>
+        <w:spacing w:after="60"/>
+        <w:rPr>
+          <w:highlight w:val="yellow"/>
+        </w:rPr>
+      </w:pPr>
       <w:proofErr w:type="spellStart"/>
       <w:proofErr w:type="gramStart"/>
       <w:r>
         <w:rPr>
           <w:rFonts w:ascii="Consolas" w:eastAsia="Consolas" w:hAnsi="Consolas" w:cs="Consolas"/>
-        </w:rPr>
-        <w:t>deplacer</w:t>
+          <w:highlight w:val="yellow"/>
+        </w:rPr>
+        <w:t>deplacerEntreColonnes</w:t>
       </w:r>
       <w:proofErr w:type="spellEnd"/>
       <w:r>
         <w:rPr>
           <w:rFonts w:ascii="Consolas" w:eastAsia="Consolas" w:hAnsi="Consolas" w:cs="Consolas"/>
+          <w:highlight w:val="yellow"/>
         </w:rPr>
         <w:t>(</w:t>
       </w:r>
@@ -851,30 +958,235 @@
       <w:r>
         <w:rPr>
           <w:rFonts w:ascii="Consolas" w:eastAsia="Consolas" w:hAnsi="Consolas" w:cs="Consolas"/>
+          <w:highlight w:val="yellow"/>
+        </w:rPr>
+        <w:t xml:space="preserve">partie, </w:t>
+      </w:r>
+      <w:proofErr w:type="spellStart"/>
+      <w:r>
+        <w:rPr>
+          <w:rFonts w:ascii="Consolas" w:eastAsia="Consolas" w:hAnsi="Consolas" w:cs="Consolas"/>
+          <w:highlight w:val="yellow"/>
+        </w:rPr>
+        <w:t>depart</w:t>
+      </w:r>
+      <w:proofErr w:type="spellEnd"/>
+      <w:r>
+        <w:rPr>
+          <w:rFonts w:ascii="Consolas" w:eastAsia="Consolas" w:hAnsi="Consolas" w:cs="Consolas"/>
+          <w:highlight w:val="yellow"/>
+        </w:rPr>
+        <w:t xml:space="preserve">, </w:t>
+      </w:r>
+      <w:proofErr w:type="spellStart"/>
+      <w:r>
+        <w:rPr>
+          <w:rFonts w:ascii="Consolas" w:eastAsia="Consolas" w:hAnsi="Consolas" w:cs="Consolas"/>
+          <w:highlight w:val="yellow"/>
+        </w:rPr>
+        <w:t>arrivee</w:t>
+      </w:r>
+      <w:proofErr w:type="spellEnd"/>
+      <w:r>
+        <w:rPr>
+          <w:rFonts w:ascii="Consolas" w:eastAsia="Consolas" w:hAnsi="Consolas" w:cs="Consolas"/>
+          <w:highlight w:val="yellow"/>
+        </w:rPr>
+        <w:t xml:space="preserve">, </w:t>
+      </w:r>
+      <w:proofErr w:type="spellStart"/>
+      <w:r>
+        <w:rPr>
+          <w:rFonts w:ascii="Consolas" w:eastAsia="Consolas" w:hAnsi="Consolas" w:cs="Consolas"/>
+          <w:highlight w:val="yellow"/>
+        </w:rPr>
+        <w:t>nbCartes</w:t>
+      </w:r>
+      <w:proofErr w:type="spellEnd"/>
+      <w:r>
+        <w:rPr>
+          <w:rFonts w:ascii="Consolas" w:eastAsia="Consolas" w:hAnsi="Consolas" w:cs="Consolas"/>
+          <w:highlight w:val="yellow"/>
         </w:rPr>
         <w:t>)</w:t>
       </w:r>
       <w:r>
-        <w:t xml:space="preserve"> : demander la source, la destination et le nombre de cartes.</w:t>
-      </w:r>
-    </w:p>
-    <w:p>
-      <w:pPr>
-        <w:pStyle w:val="Paragraphedeliste"/>
-        <w:numPr>
-          <w:ilvl w:val="0"/>
-          <w:numId w:val="2"/>
-        </w:numPr>
-        <w:spacing w:after="60"/>
-      </w:pPr>
-      <w:r>
-        <w:t>Vérifier que la saisie est valide (numéro de colonne entre 1 et 7, nombre de cartes disponible…).</w:t>
-      </w:r>
+        <w:rPr>
+          <w:highlight w:val="yellow"/>
+        </w:rPr>
+        <w:t xml:space="preserve"> : déplace une ou plusieurs cartes visibles et retourne la carte cachée libérée.</w:t>
+      </w:r>
+    </w:p>
+    <w:p>
+      <w:pPr>
+        <w:pStyle w:val="Paragraphedeliste"/>
+        <w:numPr>
+          <w:ilvl w:val="0"/>
+          <w:numId w:val="2"/>
+        </w:numPr>
+        <w:spacing w:after="60"/>
+        <w:rPr>
+          <w:highlight w:val="yellow"/>
+        </w:rPr>
+      </w:pPr>
+      <w:r>
+        <w:rPr>
+          <w:highlight w:val="yellow"/>
+        </w:rPr>
+        <w:t xml:space="preserve">La façon de désigner une source et une destination, par exemple </w:t>
+      </w:r>
+      <w:r>
+        <w:rPr>
+          <w:rFonts w:ascii="Consolas" w:eastAsia="Consolas" w:hAnsi="Consolas" w:cs="Consolas"/>
+          <w:highlight w:val="yellow"/>
+        </w:rPr>
+        <w:t>1</w:t>
+      </w:r>
+      <w:r>
+        <w:rPr>
+          <w:highlight w:val="yellow"/>
+        </w:rPr>
+        <w:t xml:space="preserve"> à </w:t>
+      </w:r>
+      <w:r>
+        <w:rPr>
+          <w:rFonts w:ascii="Consolas" w:eastAsia="Consolas" w:hAnsi="Consolas" w:cs="Consolas"/>
+          <w:highlight w:val="yellow"/>
+        </w:rPr>
+        <w:t>7</w:t>
+      </w:r>
+      <w:r>
+        <w:rPr>
+          <w:highlight w:val="yellow"/>
+        </w:rPr>
+        <w:t xml:space="preserve"> pour les colonnes, </w:t>
+      </w:r>
+      <w:r>
+        <w:rPr>
+          <w:rFonts w:ascii="Consolas" w:eastAsia="Consolas" w:hAnsi="Consolas" w:cs="Consolas"/>
+          <w:highlight w:val="yellow"/>
+        </w:rPr>
+        <w:t>D</w:t>
+      </w:r>
+      <w:r>
+        <w:rPr>
+          <w:highlight w:val="yellow"/>
+        </w:rPr>
+        <w:t xml:space="preserve"> pour la défausse, </w:t>
+      </w:r>
+      <w:r>
+        <w:rPr>
+          <w:rFonts w:ascii="Consolas" w:eastAsia="Consolas" w:hAnsi="Consolas" w:cs="Consolas"/>
+          <w:highlight w:val="yellow"/>
+        </w:rPr>
+        <w:t>F</w:t>
+      </w:r>
+      <w:r>
+        <w:rPr>
+          <w:highlight w:val="yellow"/>
+        </w:rPr>
+        <w:t xml:space="preserve"> pour les fondations. Toutes les fonctions suivantes en dépendent.</w:t>
+      </w:r>
+    </w:p>
+    <w:p>
+      <w:pPr>
+        <w:spacing w:after="60"/>
+      </w:pPr>
     </w:p>
     <w:p>
       <w:pPr>
         <w:pStyle w:val="Titre2"/>
-      </w:pPr>
+        <w:rPr>
+          <w:highlight w:val="yellow"/>
+        </w:rPr>
+      </w:pPr>
+      <w:r>
+        <w:rPr>
+          <w:highlight w:val="yellow"/>
+        </w:rPr>
+        <w:t>Membre A</w:t>
+      </w:r>
+    </w:p>
+    <w:p>
+      <w:pPr>
+        <w:pStyle w:val="Paragraphedeliste"/>
+        <w:numPr>
+          <w:ilvl w:val="0"/>
+          <w:numId w:val="2"/>
+        </w:numPr>
+        <w:spacing w:after="60"/>
+        <w:rPr>
+          <w:highlight w:val="yellow"/>
+        </w:rPr>
+      </w:pPr>
+      <w:proofErr w:type="gramStart"/>
+      <w:r>
+        <w:rPr>
+          <w:rFonts w:ascii="Consolas" w:eastAsia="Consolas" w:hAnsi="Consolas" w:cs="Consolas"/>
+          <w:highlight w:val="yellow"/>
+        </w:rPr>
+        <w:t>piocher(</w:t>
+      </w:r>
+      <w:proofErr w:type="gramEnd"/>
+      <w:r>
+        <w:rPr>
+          <w:rFonts w:ascii="Consolas" w:eastAsia="Consolas" w:hAnsi="Consolas" w:cs="Consolas"/>
+          <w:highlight w:val="yellow"/>
+        </w:rPr>
+        <w:t>)</w:t>
+      </w:r>
+      <w:r>
+        <w:rPr>
+          <w:highlight w:val="yellow"/>
+        </w:rPr>
+        <w:t xml:space="preserve"> : retourne une carte de la pioche vers la défausse.</w:t>
+      </w:r>
+    </w:p>
+    <w:p>
+      <w:pPr>
+        <w:pStyle w:val="Paragraphedeliste"/>
+        <w:numPr>
+          <w:ilvl w:val="0"/>
+          <w:numId w:val="2"/>
+        </w:numPr>
+        <w:spacing w:after="60"/>
+        <w:rPr>
+          <w:highlight w:val="yellow"/>
+        </w:rPr>
+      </w:pPr>
+      <w:r>
+        <w:rPr>
+          <w:highlight w:val="yellow"/>
+        </w:rPr>
+        <w:t>Quand la pioche est vide, remettre la défausse dans la pioche.</w:t>
+      </w:r>
+    </w:p>
+    <w:p>
+      <w:pPr>
+        <w:pStyle w:val="Paragraphedeliste"/>
+        <w:numPr>
+          <w:ilvl w:val="0"/>
+          <w:numId w:val="2"/>
+        </w:numPr>
+        <w:spacing w:after="60"/>
+        <w:rPr>
+          <w:highlight w:val="yellow"/>
+        </w:rPr>
+      </w:pPr>
+      <w:r>
+        <w:rPr>
+          <w:highlight w:val="yellow"/>
+        </w:rPr>
+        <w:t>Déplacement de la défausse vers une colonne.</w:t>
+      </w:r>
+    </w:p>
+    <w:p>
+      <w:pPr>
+        <w:pStyle w:val="Titre2"/>
+      </w:pPr>
+      <w:r>
+        <w:t>Membre B</w:t>
+      </w:r>
     </w:p>
     <w:p>
       <w:pPr>
@@ -891,18 +1203,37 @@
         <w:rPr>
           <w:rFonts w:ascii="Consolas" w:eastAsia="Consolas" w:hAnsi="Consolas" w:cs="Consolas"/>
         </w:rPr>
-        <w:t>estRouge</w:t>
+        <w:t>peutPoserSurFondation</w:t>
       </w:r>
       <w:proofErr w:type="spellEnd"/>
+      <w:r>
+        <w:rPr>
+          <w:rFonts w:ascii="Consolas" w:eastAsia="Consolas" w:hAnsi="Consolas" w:cs="Consolas"/>
+        </w:rPr>
+        <w:t>(</w:t>
+      </w:r>
       <w:proofErr w:type="gramEnd"/>
       <w:r>
         <w:rPr>
           <w:rFonts w:ascii="Consolas" w:eastAsia="Consolas" w:hAnsi="Consolas" w:cs="Consolas"/>
         </w:rPr>
-        <w:t>(carte)</w:t>
-      </w:r>
-      <w:r>
-        <w:t xml:space="preserve"> : indique si une carte est rouge (cœur, carreau).</w:t>
+        <w:t>carte, fondations)</w:t>
+      </w:r>
+      <w:r>
+        <w:t xml:space="preserve"> : un As sur une fondation vide, puis la valeur suivante de la même famille.</w:t>
+      </w:r>
+    </w:p>
+    <w:p>
+      <w:pPr>
+        <w:pStyle w:val="Paragraphedeliste"/>
+        <w:numPr>
+          <w:ilvl w:val="0"/>
+          <w:numId w:val="2"/>
+        </w:numPr>
+        <w:spacing w:after="60"/>
+      </w:pPr>
+      <w:r>
+        <w:t>Déplacements colonne → fondation et défausse → fondation.</w:t>
       </w:r>
     </w:p>
     <w:p>
@@ -920,8 +1251,7 @@
         <w:rPr>
           <w:rFonts w:ascii="Consolas" w:eastAsia="Consolas" w:hAnsi="Consolas" w:cs="Consolas"/>
         </w:rPr>
-        <w:lastRenderedPageBreak/>
-        <w:t>peutPoserSurColonne</w:t>
+        <w:t>partieGagnee</w:t>
       </w:r>
       <w:proofErr w:type="spellEnd"/>
       <w:r>
@@ -935,10 +1265,42 @@
         <w:rPr>
           <w:rFonts w:ascii="Consolas" w:eastAsia="Consolas" w:hAnsi="Consolas" w:cs="Consolas"/>
         </w:rPr>
-        <w:t>carte, colonne)</w:t>
-      </w:r>
-      <w:r>
-        <w:t xml:space="preserve"> : couleur alternée et valeur inférieure de 1, ou un Roi sur une colonne vide.</w:t>
+        <w:t>)</w:t>
+      </w:r>
+      <w:r>
+        <w:t xml:space="preserve"> : renvoie True quand les 4 fondations contiennent 13 cartes.</w:t>
+      </w:r>
+    </w:p>
+    <w:p>
+      <w:pPr>
+        <w:spacing w:after="60"/>
+      </w:pPr>
+    </w:p>
+    <w:p>
+      <w:pPr>
+        <w:pStyle w:val="Titre1"/>
+      </w:pPr>
+    </w:p>
+    <w:p>
+      <w:pPr>
+        <w:pStyle w:val="Titre1"/>
+      </w:pPr>
+      <w:r>
+        <w:t xml:space="preserve">Point </w:t>
+      </w:r>
+      <w:r>
+        <w:t>2</w:t>
+      </w:r>
+      <w:r>
+        <w:t xml:space="preserve"> – Lundi 2 novembre : sauvegarde et aide</w:t>
+      </w:r>
+    </w:p>
+    <w:p>
+      <w:pPr>
+        <w:pStyle w:val="Titre2"/>
+      </w:pPr>
+      <w:r>
+        <w:t>Membre A</w:t>
       </w:r>
     </w:p>
     <w:p>
@@ -956,7 +1318,7 @@
         <w:rPr>
           <w:rFonts w:ascii="Consolas" w:eastAsia="Consolas" w:hAnsi="Consolas" w:cs="Consolas"/>
         </w:rPr>
-        <w:t>deplacerEntreColonnes</w:t>
+        <w:t>sauvegarderPartie</w:t>
       </w:r>
       <w:proofErr w:type="spellEnd"/>
       <w:r>
@@ -970,193 +1332,18 @@
         <w:rPr>
           <w:rFonts w:ascii="Consolas" w:eastAsia="Consolas" w:hAnsi="Consolas" w:cs="Consolas"/>
         </w:rPr>
-        <w:t xml:space="preserve">partie, </w:t>
-      </w:r>
-      <w:proofErr w:type="spellStart"/>
-      <w:r>
-        <w:rPr>
-          <w:rFonts w:ascii="Consolas" w:eastAsia="Consolas" w:hAnsi="Consolas" w:cs="Consolas"/>
-        </w:rPr>
-        <w:t>depart</w:t>
-      </w:r>
-      <w:proofErr w:type="spellEnd"/>
-      <w:r>
-        <w:rPr>
-          <w:rFonts w:ascii="Consolas" w:eastAsia="Consolas" w:hAnsi="Consolas" w:cs="Consolas"/>
-        </w:rPr>
-        <w:t xml:space="preserve">, </w:t>
-      </w:r>
-      <w:proofErr w:type="spellStart"/>
-      <w:r>
-        <w:rPr>
-          <w:rFonts w:ascii="Consolas" w:eastAsia="Consolas" w:hAnsi="Consolas" w:cs="Consolas"/>
-        </w:rPr>
-        <w:t>arrivee</w:t>
-      </w:r>
-      <w:proofErr w:type="spellEnd"/>
-      <w:r>
-        <w:rPr>
-          <w:rFonts w:ascii="Consolas" w:eastAsia="Consolas" w:hAnsi="Consolas" w:cs="Consolas"/>
-        </w:rPr>
-        <w:t xml:space="preserve">, </w:t>
-      </w:r>
-      <w:proofErr w:type="spellStart"/>
-      <w:r>
-        <w:rPr>
-          <w:rFonts w:ascii="Consolas" w:eastAsia="Consolas" w:hAnsi="Consolas" w:cs="Consolas"/>
-        </w:rPr>
-        <w:t>nbCartes</w:t>
-      </w:r>
-      <w:proofErr w:type="spellEnd"/>
-      <w:r>
-        <w:rPr>
-          <w:rFonts w:ascii="Consolas" w:eastAsia="Consolas" w:hAnsi="Consolas" w:cs="Consolas"/>
-        </w:rPr>
         <w:t>)</w:t>
       </w:r>
       <w:r>
-        <w:t xml:space="preserve"> : déplace une ou plusieurs cartes visibles et retourne la carte cachée libérée.</w:t>
-      </w:r>
-    </w:p>
-    <w:p>
-      <w:pPr>
-        <w:pStyle w:val="Paragraphedeliste"/>
-        <w:numPr>
-          <w:ilvl w:val="0"/>
-          <w:numId w:val="2"/>
-        </w:numPr>
-        <w:spacing w:after="60"/>
-      </w:pPr>
-      <w:r>
-        <w:t xml:space="preserve">La façon de désigner une source et une destination, par exemple </w:t>
-      </w:r>
-      <w:r>
-        <w:rPr>
-          <w:rFonts w:ascii="Consolas" w:eastAsia="Consolas" w:hAnsi="Consolas" w:cs="Consolas"/>
-        </w:rPr>
-        <w:t>1</w:t>
-      </w:r>
-      <w:r>
-        <w:t xml:space="preserve"> à </w:t>
-      </w:r>
-      <w:r>
-        <w:rPr>
-          <w:rFonts w:ascii="Consolas" w:eastAsia="Consolas" w:hAnsi="Consolas" w:cs="Consolas"/>
-        </w:rPr>
-        <w:t>7</w:t>
-      </w:r>
-      <w:r>
-        <w:t xml:space="preserve"> pour les colonnes, </w:t>
-      </w:r>
-      <w:r>
-        <w:rPr>
-          <w:rFonts w:ascii="Consolas" w:eastAsia="Consolas" w:hAnsi="Consolas" w:cs="Consolas"/>
-        </w:rPr>
-        <w:t>D</w:t>
-      </w:r>
-      <w:r>
-        <w:t xml:space="preserve"> pour la défausse, </w:t>
-      </w:r>
-      <w:r>
-        <w:rPr>
-          <w:rFonts w:ascii="Consolas" w:eastAsia="Consolas" w:hAnsi="Consolas" w:cs="Consolas"/>
-        </w:rPr>
-        <w:t>F</w:t>
-      </w:r>
-      <w:r>
-        <w:t xml:space="preserve"> pour les fondations. Toutes les fonctions suivantes en dépendent.</w:t>
-      </w:r>
-    </w:p>
-    <w:p>
-      <w:pPr>
-        <w:spacing w:after="60"/>
-      </w:pPr>
-    </w:p>
-    <w:p>
-      <w:pPr>
-        <w:pStyle w:val="Titre2"/>
-      </w:pPr>
-      <w:r>
-        <w:t>Membre A</w:t>
-      </w:r>
-    </w:p>
-    <w:p>
-      <w:pPr>
-        <w:pStyle w:val="Paragraphedeliste"/>
-        <w:numPr>
-          <w:ilvl w:val="0"/>
-          <w:numId w:val="2"/>
-        </w:numPr>
-        <w:spacing w:after="60"/>
-      </w:pPr>
-      <w:proofErr w:type="gramStart"/>
-      <w:r>
-        <w:rPr>
-          <w:rFonts w:ascii="Consolas" w:eastAsia="Consolas" w:hAnsi="Consolas" w:cs="Consolas"/>
-        </w:rPr>
-        <w:t>piocher(</w:t>
-      </w:r>
-      <w:proofErr w:type="gramEnd"/>
-      <w:r>
-        <w:rPr>
-          <w:rFonts w:ascii="Consolas" w:eastAsia="Consolas" w:hAnsi="Consolas" w:cs="Consolas"/>
-        </w:rPr>
-        <w:t>)</w:t>
-      </w:r>
-      <w:r>
-        <w:t xml:space="preserve"> : retourne une carte de la pioche vers la défausse.</w:t>
-      </w:r>
-    </w:p>
-    <w:p>
-      <w:pPr>
-        <w:pStyle w:val="Paragraphedeliste"/>
-        <w:numPr>
-          <w:ilvl w:val="0"/>
-          <w:numId w:val="2"/>
-        </w:numPr>
-        <w:spacing w:after="60"/>
-      </w:pPr>
-      <w:r>
-        <w:t>Quand la pioche est vide, remettre la défausse dans la pioche.</w:t>
-      </w:r>
-    </w:p>
-    <w:p>
-      <w:pPr>
-        <w:pStyle w:val="Paragraphedeliste"/>
-        <w:numPr>
-          <w:ilvl w:val="0"/>
-          <w:numId w:val="2"/>
-        </w:numPr>
-        <w:spacing w:after="60"/>
-      </w:pPr>
-      <w:r>
-        <w:t>Déplacement de la défausse vers une colonne.</w:t>
-      </w:r>
-    </w:p>
-    <w:p>
-      <w:pPr>
-        <w:pStyle w:val="Titre2"/>
-      </w:pPr>
-      <w:r>
-        <w:t>Membre B</w:t>
-      </w:r>
-    </w:p>
-    <w:p>
-      <w:pPr>
-        <w:pStyle w:val="Paragraphedeliste"/>
-        <w:numPr>
-          <w:ilvl w:val="0"/>
-          <w:numId w:val="2"/>
-        </w:numPr>
-        <w:spacing w:after="60"/>
-      </w:pPr>
+        <w:t xml:space="preserve"> et </w:t>
+      </w:r>
       <w:proofErr w:type="spellStart"/>
       <w:proofErr w:type="gramStart"/>
       <w:r>
         <w:rPr>
           <w:rFonts w:ascii="Consolas" w:eastAsia="Consolas" w:hAnsi="Consolas" w:cs="Consolas"/>
         </w:rPr>
-        <w:t>peutPoserSurFondation</w:t>
+        <w:t>chargerPartie</w:t>
       </w:r>
       <w:proofErr w:type="spellEnd"/>
       <w:r>
@@ -1170,23 +1357,42 @@
         <w:rPr>
           <w:rFonts w:ascii="Consolas" w:eastAsia="Consolas" w:hAnsi="Consolas" w:cs="Consolas"/>
         </w:rPr>
-        <w:t>carte, fondations)</w:t>
-      </w:r>
-      <w:r>
-        <w:t xml:space="preserve"> : un As sur une fondation vide, puis la valeur suivante de la même famille.</w:t>
-      </w:r>
-    </w:p>
-    <w:p>
-      <w:pPr>
-        <w:pStyle w:val="Paragraphedeliste"/>
-        <w:numPr>
-          <w:ilvl w:val="0"/>
-          <w:numId w:val="2"/>
-        </w:numPr>
-        <w:spacing w:after="60"/>
-      </w:pPr>
-      <w:r>
-        <w:t>Déplacements colonne → fondation et défausse → fondation.</w:t>
+        <w:t>)</w:t>
+      </w:r>
+      <w:r>
+        <w:t xml:space="preserve"> : enregistrer la partie dans un fichier et la relire.</w:t>
+      </w:r>
+    </w:p>
+    <w:p>
+      <w:pPr>
+        <w:pStyle w:val="Paragraphedeliste"/>
+        <w:numPr>
+          <w:ilvl w:val="0"/>
+          <w:numId w:val="2"/>
+        </w:numPr>
+        <w:spacing w:after="60"/>
+      </w:pPr>
+      <w:r>
+        <w:t xml:space="preserve">Attention : avec le module </w:t>
+      </w:r>
+      <w:proofErr w:type="spellStart"/>
+      <w:r>
+        <w:rPr>
+          <w:rFonts w:ascii="Consolas" w:eastAsia="Consolas" w:hAnsi="Consolas" w:cs="Consolas"/>
+        </w:rPr>
+        <w:t>json</w:t>
+      </w:r>
+      <w:proofErr w:type="spellEnd"/>
+      <w:r>
+        <w:t>, les tuples sont enregistrés comme des listes. Il faut les reconvertir en tuples au chargement.</w:t>
+      </w:r>
+    </w:p>
+    <w:p>
+      <w:pPr>
+        <w:pStyle w:val="Titre2"/>
+      </w:pPr>
+      <w:r>
+        <w:t>Membre B</w:t>
       </w:r>
     </w:p>
     <w:p>
@@ -1204,7 +1410,7 @@
         <w:rPr>
           <w:rFonts w:ascii="Consolas" w:eastAsia="Consolas" w:hAnsi="Consolas" w:cs="Consolas"/>
         </w:rPr>
-        <w:t>partieGagnee</w:t>
+        <w:t>proposerCoups</w:t>
       </w:r>
       <w:proofErr w:type="spellEnd"/>
       <w:r>
@@ -1221,31 +1427,45 @@
         <w:t>)</w:t>
       </w:r>
       <w:r>
-        <w:t xml:space="preserve"> : renvoie True quand les 4 fondations contiennent 13 cartes.</w:t>
-      </w:r>
-    </w:p>
-    <w:p>
-      <w:pPr>
-        <w:spacing w:after="60"/>
-      </w:pPr>
+        <w:t xml:space="preserve"> : parcourir tous les déplacements possibles (colonnes, défausse, fondations) et les afficher.</w:t>
+      </w:r>
+    </w:p>
+    <w:p>
+      <w:pPr>
+        <w:pStyle w:val="Paragraphedeliste"/>
+        <w:numPr>
+          <w:ilvl w:val="0"/>
+          <w:numId w:val="2"/>
+        </w:numPr>
+        <w:spacing w:after="60"/>
+      </w:pPr>
+      <w:r>
+        <w:t xml:space="preserve">Réutiliser les fonctions </w:t>
+      </w:r>
+      <w:proofErr w:type="spellStart"/>
+      <w:r>
+        <w:rPr>
+          <w:rFonts w:ascii="Consolas" w:eastAsia="Consolas" w:hAnsi="Consolas" w:cs="Consolas"/>
+        </w:rPr>
+        <w:t>peutPoser</w:t>
+      </w:r>
+      <w:proofErr w:type="spellEnd"/>
+      <w:r>
+        <w:rPr>
+          <w:rFonts w:ascii="Consolas" w:eastAsia="Consolas" w:hAnsi="Consolas" w:cs="Consolas"/>
+        </w:rPr>
+        <w:t>…</w:t>
+      </w:r>
+      <w:r>
+        <w:t xml:space="preserve"> écrites aux points 1 et 2 pour savoir si un coup est autorisé.</w:t>
+      </w:r>
     </w:p>
     <w:p>
       <w:pPr>
         <w:pStyle w:val="Titre1"/>
       </w:pPr>
-    </w:p>
-    <w:p>
-      <w:pPr>
-        <w:pStyle w:val="Titre1"/>
-      </w:pPr>
-      <w:r>
-        <w:t xml:space="preserve">Point </w:t>
-      </w:r>
-      <w:r>
-        <w:t>2</w:t>
-      </w:r>
-      <w:r>
-        <w:t xml:space="preserve"> – Lundi 2 novembre : sauvegarde et aide</w:t>
+      <w:r>
+        <w:t>Point 4 – Mercredi 4 novembre : paramètres et finitions</w:t>
       </w:r>
     </w:p>
     <w:p>
@@ -1271,7 +1491,7 @@
         <w:rPr>
           <w:rFonts w:ascii="Consolas" w:eastAsia="Consolas" w:hAnsi="Consolas" w:cs="Consolas"/>
         </w:rPr>
-        <w:t>sauvegarderPartie</w:t>
+        <w:t>modifierParametres</w:t>
       </w:r>
       <w:proofErr w:type="spellEnd"/>
       <w:r>
@@ -1288,56 +1508,20 @@
         <w:t>)</w:t>
       </w:r>
       <w:r>
-        <w:t xml:space="preserve"> et </w:t>
-      </w:r>
-      <w:proofErr w:type="spellStart"/>
-      <w:proofErr w:type="gramStart"/>
-      <w:r>
-        <w:rPr>
-          <w:rFonts w:ascii="Consolas" w:eastAsia="Consolas" w:hAnsi="Consolas" w:cs="Consolas"/>
-        </w:rPr>
-        <w:t>chargerPartie</w:t>
-      </w:r>
-      <w:proofErr w:type="spellEnd"/>
-      <w:r>
-        <w:rPr>
-          <w:rFonts w:ascii="Consolas" w:eastAsia="Consolas" w:hAnsi="Consolas" w:cs="Consolas"/>
-        </w:rPr>
-        <w:t>(</w:t>
-      </w:r>
-      <w:proofErr w:type="gramEnd"/>
-      <w:r>
-        <w:rPr>
-          <w:rFonts w:ascii="Consolas" w:eastAsia="Consolas" w:hAnsi="Consolas" w:cs="Consolas"/>
-        </w:rPr>
-        <w:t>)</w:t>
-      </w:r>
-      <w:r>
-        <w:t xml:space="preserve"> : enregistrer la partie dans un fichier et la relire.</w:t>
-      </w:r>
-    </w:p>
-    <w:p>
-      <w:pPr>
-        <w:pStyle w:val="Paragraphedeliste"/>
-        <w:numPr>
-          <w:ilvl w:val="0"/>
-          <w:numId w:val="2"/>
-        </w:numPr>
-        <w:spacing w:after="60"/>
-      </w:pPr>
-      <w:r>
-        <w:t xml:space="preserve">Attention : avec le module </w:t>
-      </w:r>
-      <w:proofErr w:type="spellStart"/>
-      <w:r>
-        <w:rPr>
-          <w:rFonts w:ascii="Consolas" w:eastAsia="Consolas" w:hAnsi="Consolas" w:cs="Consolas"/>
-        </w:rPr>
-        <w:t>json</w:t>
-      </w:r>
-      <w:proofErr w:type="spellEnd"/>
-      <w:r>
-        <w:t>, les tuples sont enregistrés comme des listes. Il faut les reconvertir en tuples au chargement.</w:t>
+        <w:t xml:space="preserve"> : menu de réglage de la difficulté.</w:t>
+      </w:r>
+    </w:p>
+    <w:p>
+      <w:pPr>
+        <w:pStyle w:val="Paragraphedeliste"/>
+        <w:numPr>
+          <w:ilvl w:val="0"/>
+          <w:numId w:val="2"/>
+        </w:numPr>
+        <w:spacing w:after="60"/>
+      </w:pPr>
+      <w:r>
+        <w:t>Exemples : piocher 1 ou 3 cartes, aide activée ou non, nombre de passages dans la pioche limité.</w:t>
       </w:r>
     </w:p>
     <w:p>
@@ -1357,60 +1541,21 @@
         </w:numPr>
         <w:spacing w:after="60"/>
       </w:pPr>
-      <w:proofErr w:type="spellStart"/>
-      <w:proofErr w:type="gramStart"/>
-      <w:r>
-        <w:rPr>
-          <w:rFonts w:ascii="Consolas" w:eastAsia="Consolas" w:hAnsi="Consolas" w:cs="Consolas"/>
-        </w:rPr>
-        <w:t>proposerCoups</w:t>
-      </w:r>
-      <w:proofErr w:type="spellEnd"/>
-      <w:r>
-        <w:rPr>
-          <w:rFonts w:ascii="Consolas" w:eastAsia="Consolas" w:hAnsi="Consolas" w:cs="Consolas"/>
-        </w:rPr>
-        <w:t>(</w:t>
-      </w:r>
-      <w:proofErr w:type="gramEnd"/>
-      <w:r>
-        <w:rPr>
-          <w:rFonts w:ascii="Consolas" w:eastAsia="Consolas" w:hAnsi="Consolas" w:cs="Consolas"/>
-        </w:rPr>
-        <w:t>)</w:t>
-      </w:r>
-      <w:r>
-        <w:t xml:space="preserve"> : parcourir tous les déplacements possibles (colonnes, défausse, fondations) et les afficher.</w:t>
-      </w:r>
-    </w:p>
-    <w:p>
-      <w:pPr>
-        <w:pStyle w:val="Paragraphedeliste"/>
-        <w:numPr>
-          <w:ilvl w:val="0"/>
-          <w:numId w:val="2"/>
-        </w:numPr>
-        <w:spacing w:after="60"/>
-      </w:pPr>
-      <w:r>
-        <w:t xml:space="preserve">Réutiliser les fonctions </w:t>
-      </w:r>
-      <w:proofErr w:type="spellStart"/>
-      <w:r>
-        <w:rPr>
-          <w:rFonts w:ascii="Consolas" w:eastAsia="Consolas" w:hAnsi="Consolas" w:cs="Consolas"/>
-        </w:rPr>
-        <w:t>peutPoser</w:t>
-      </w:r>
-      <w:proofErr w:type="spellEnd"/>
-      <w:r>
-        <w:rPr>
-          <w:rFonts w:ascii="Consolas" w:eastAsia="Consolas" w:hAnsi="Consolas" w:cs="Consolas"/>
-        </w:rPr>
-        <w:t>…</w:t>
-      </w:r>
-      <w:r>
-        <w:t xml:space="preserve"> écrites aux points 1 et 2 pour savoir si un coup est autorisé.</w:t>
+      <w:r>
+        <w:t>Une fonctionnalité originale pour se démarquer : annuler le dernier coup, compteur de coups, score…</w:t>
+      </w:r>
+    </w:p>
+    <w:p>
+      <w:pPr>
+        <w:pStyle w:val="Paragraphedeliste"/>
+        <w:numPr>
+          <w:ilvl w:val="0"/>
+          <w:numId w:val="2"/>
+        </w:numPr>
+        <w:spacing w:after="60"/>
+      </w:pPr>
+      <w:r>
+        <w:t>Tests complets d'une partie du début à la fin.</w:t>
       </w:r>
     </w:p>
     <w:p>
@@ -1418,109 +1563,8 @@
         <w:pStyle w:val="Titre1"/>
       </w:pPr>
       <w:r>
-        <w:t>Point 4 – Mercredi 4 novembre : paramètres et finitions</w:t>
-      </w:r>
-    </w:p>
-    <w:p>
-      <w:pPr>
-        <w:pStyle w:val="Titre2"/>
-      </w:pPr>
-      <w:r>
-        <w:t>Membre A</w:t>
-      </w:r>
-    </w:p>
-    <w:p>
-      <w:pPr>
-        <w:pStyle w:val="Paragraphedeliste"/>
-        <w:numPr>
-          <w:ilvl w:val="0"/>
-          <w:numId w:val="2"/>
-        </w:numPr>
-        <w:spacing w:after="60"/>
-      </w:pPr>
-      <w:proofErr w:type="spellStart"/>
-      <w:proofErr w:type="gramStart"/>
-      <w:r>
-        <w:rPr>
-          <w:rFonts w:ascii="Consolas" w:eastAsia="Consolas" w:hAnsi="Consolas" w:cs="Consolas"/>
-        </w:rPr>
-        <w:t>modifierParametres</w:t>
-      </w:r>
-      <w:proofErr w:type="spellEnd"/>
-      <w:r>
-        <w:rPr>
-          <w:rFonts w:ascii="Consolas" w:eastAsia="Consolas" w:hAnsi="Consolas" w:cs="Consolas"/>
-        </w:rPr>
-        <w:t>(</w:t>
-      </w:r>
-      <w:proofErr w:type="gramEnd"/>
-      <w:r>
-        <w:rPr>
-          <w:rFonts w:ascii="Consolas" w:eastAsia="Consolas" w:hAnsi="Consolas" w:cs="Consolas"/>
-        </w:rPr>
-        <w:t>)</w:t>
-      </w:r>
-      <w:r>
-        <w:t xml:space="preserve"> : menu de réglage de la difficulté.</w:t>
-      </w:r>
-    </w:p>
-    <w:p>
-      <w:pPr>
-        <w:pStyle w:val="Paragraphedeliste"/>
-        <w:numPr>
-          <w:ilvl w:val="0"/>
-          <w:numId w:val="2"/>
-        </w:numPr>
-        <w:spacing w:after="60"/>
-      </w:pPr>
-      <w:r>
-        <w:t>Exemples : piocher 1 ou 3 cartes, aide activée ou non, nombre de passages dans la pioche limité.</w:t>
-      </w:r>
-    </w:p>
-    <w:p>
-      <w:pPr>
-        <w:pStyle w:val="Titre2"/>
-      </w:pPr>
-      <w:r>
-        <w:t>Membre B</w:t>
-      </w:r>
-    </w:p>
-    <w:p>
-      <w:pPr>
-        <w:pStyle w:val="Paragraphedeliste"/>
-        <w:numPr>
-          <w:ilvl w:val="0"/>
-          <w:numId w:val="2"/>
-        </w:numPr>
-        <w:spacing w:after="60"/>
-      </w:pPr>
-      <w:r>
-        <w:t>Une fonctionnalité originale pour se démarquer : annuler le dernier coup, compteur de coups, score…</w:t>
-      </w:r>
-    </w:p>
-    <w:p>
-      <w:pPr>
-        <w:pStyle w:val="Paragraphedeliste"/>
-        <w:numPr>
-          <w:ilvl w:val="0"/>
-          <w:numId w:val="2"/>
-        </w:numPr>
-        <w:spacing w:after="60"/>
-      </w:pPr>
-      <w:r>
-        <w:t>Tests complets d'une partie du début à la fin.</w:t>
-      </w:r>
-    </w:p>
-    <w:p>
-      <w:pPr>
-        <w:pStyle w:val="Titre1"/>
-      </w:pPr>
-      <w:r>
         <w:lastRenderedPageBreak/>
-        <w:t xml:space="preserve">Vendredi </w:t>
-      </w:r>
-      <w:r>
-        <w:t>6 novembre : dossier et dépôt</w:t>
+        <w:t>Vendredi 6 novembre : dossier et dépôt</w:t>
       </w:r>
     </w:p>
     <w:p>

</xml_diff>

<commit_message>
Ajout de la condition de victoire
</commit_message>
<xml_diff>
--- a/Planning_Solitaire.docx
+++ b/Planning_Solitaire.docx
@@ -1183,8 +1183,14 @@
     <w:p>
       <w:pPr>
         <w:pStyle w:val="Titre2"/>
-      </w:pPr>
-      <w:r>
+        <w:rPr>
+          <w:highlight w:val="yellow"/>
+        </w:rPr>
+      </w:pPr>
+      <w:r>
+        <w:rPr>
+          <w:highlight w:val="yellow"/>
+        </w:rPr>
         <w:t>Membre B</w:t>
       </w:r>
     </w:p>
@@ -1196,12 +1202,16 @@
           <w:numId w:val="2"/>
         </w:numPr>
         <w:spacing w:after="60"/>
+        <w:rPr>
+          <w:highlight w:val="yellow"/>
+        </w:rPr>
       </w:pPr>
       <w:proofErr w:type="spellStart"/>
       <w:proofErr w:type="gramStart"/>
       <w:r>
         <w:rPr>
           <w:rFonts w:ascii="Consolas" w:eastAsia="Consolas" w:hAnsi="Consolas" w:cs="Consolas"/>
+          <w:highlight w:val="yellow"/>
         </w:rPr>
         <w:t>peutPoserSurFondation</w:t>
       </w:r>
@@ -1209,6 +1219,7 @@
       <w:r>
         <w:rPr>
           <w:rFonts w:ascii="Consolas" w:eastAsia="Consolas" w:hAnsi="Consolas" w:cs="Consolas"/>
+          <w:highlight w:val="yellow"/>
         </w:rPr>
         <w:t>(</w:t>
       </w:r>
@@ -1216,10 +1227,14 @@
       <w:r>
         <w:rPr>
           <w:rFonts w:ascii="Consolas" w:eastAsia="Consolas" w:hAnsi="Consolas" w:cs="Consolas"/>
+          <w:highlight w:val="yellow"/>
         </w:rPr>
         <w:t>carte, fondations)</w:t>
       </w:r>
       <w:r>
+        <w:rPr>
+          <w:highlight w:val="yellow"/>
+        </w:rPr>
         <w:t xml:space="preserve"> : un As sur une fondation vide, puis la valeur suivante de la même famille.</w:t>
       </w:r>
     </w:p>
@@ -1231,8 +1246,14 @@
           <w:numId w:val="2"/>
         </w:numPr>
         <w:spacing w:after="60"/>
-      </w:pPr>
-      <w:r>
+        <w:rPr>
+          <w:highlight w:val="yellow"/>
+        </w:rPr>
+      </w:pPr>
+      <w:r>
+        <w:rPr>
+          <w:highlight w:val="yellow"/>
+        </w:rPr>
         <w:t>Déplacements colonne → fondation et défausse → fondation.</w:t>
       </w:r>
     </w:p>

</xml_diff>

<commit_message>
ajout du déplacement d'une fondation vers une colonne
</commit_message>
<xml_diff>
--- a/Planning_Solitaire.docx
+++ b/Planning_Solitaire.docx
@@ -1164,25 +1164,18 @@
     <w:p>
       <w:pPr>
         <w:pStyle w:val="Paragraphedeliste"/>
-        <w:numPr>
-          <w:ilvl w:val="0"/>
-          <w:numId w:val="2"/>
-        </w:numPr>
-        <w:spacing w:after="60"/>
-        <w:rPr>
-          <w:highlight w:val="yellow"/>
-        </w:rPr>
-      </w:pPr>
-      <w:r>
-        <w:rPr>
-          <w:highlight w:val="yellow"/>
-        </w:rPr>
-        <w:t>Déplacement de la défausse vers une colonne.</w:t>
-      </w:r>
-    </w:p>
-    <w:p>
-      <w:pPr>
-        <w:pStyle w:val="Titre2"/>
+        <w:spacing w:after="60"/>
+        <w:ind w:left="720"/>
+        <w:rPr>
+          <w:highlight w:val="yellow"/>
+        </w:rPr>
+      </w:pPr>
+    </w:p>
+    <w:p>
+      <w:pPr>
+        <w:pStyle w:val="Paragraphedeliste"/>
+        <w:spacing w:after="60"/>
+        <w:ind w:left="720"/>
         <w:rPr>
           <w:highlight w:val="yellow"/>
         </w:rPr>
@@ -1265,12 +1258,16 @@
           <w:numId w:val="2"/>
         </w:numPr>
         <w:spacing w:after="60"/>
+        <w:rPr>
+          <w:highlight w:val="yellow"/>
+        </w:rPr>
       </w:pPr>
       <w:proofErr w:type="spellStart"/>
       <w:proofErr w:type="gramStart"/>
       <w:r>
         <w:rPr>
           <w:rFonts w:ascii="Consolas" w:eastAsia="Consolas" w:hAnsi="Consolas" w:cs="Consolas"/>
+          <w:highlight w:val="yellow"/>
         </w:rPr>
         <w:t>partieGagnee</w:t>
       </w:r>
@@ -1278,6 +1275,7 @@
       <w:r>
         <w:rPr>
           <w:rFonts w:ascii="Consolas" w:eastAsia="Consolas" w:hAnsi="Consolas" w:cs="Consolas"/>
+          <w:highlight w:val="yellow"/>
         </w:rPr>
         <w:t>(</w:t>
       </w:r>
@@ -1285,10 +1283,14 @@
       <w:r>
         <w:rPr>
           <w:rFonts w:ascii="Consolas" w:eastAsia="Consolas" w:hAnsi="Consolas" w:cs="Consolas"/>
+          <w:highlight w:val="yellow"/>
         </w:rPr>
         <w:t>)</w:t>
       </w:r>
       <w:r>
+        <w:rPr>
+          <w:highlight w:val="yellow"/>
+        </w:rPr>
         <w:t xml:space="preserve"> : renvoie True quand les 4 fondations contiennent 13 cartes.</w:t>
       </w:r>
     </w:p>

</xml_diff>